<commit_message>
feat(batch-6): import 22 milestone tasks to YouTrack and synchronize project links
</commit_message>
<xml_diff>
--- a/docs/supervisor-review-report.docx
+++ b/docs/supervisor-review-report.docx
@@ -4399,7 +4399,7 @@
               <w:rPr>
                 <w:sz w:val="17"/>
               </w:rPr>
-              <w:t>**In Progress (Instance active)**</w:t>
+              <w:t>**Completed (Synchronized)**</w:t>
             </w:r>
           </w:p>
         </w:tc>
@@ -4638,7 +4638,7 @@
           <w:color w:val="2E75B6"/>
           <w:sz w:val="24"/>
         </w:rPr>
-        <w:t>9.2 Remote Git &amp; Review Archive</w:t>
+        <w:t>9.2 Project Tracking, Remote Git &amp; Review Archive</w:t>
       </w:r>
     </w:p>
     <w:p>
@@ -4651,30 +4651,40 @@
         <w:rPr>
           <w:b/>
         </w:rPr>
-        <w:t>Remote Branch</w:t>
-      </w:r>
-      <w:r>
-        <w:t xml:space="preserve">: </w:t>
+        <w:t>YouTrack Cloud Project</w:t>
+      </w:r>
+      <w:r>
+        <w:t xml:space="preserve">: https://bekzat-diploma-2027.youtrack.cloud/projects/PLP (Project Key: </w:t>
       </w:r>
       <w:r>
         <w:rPr>
           <w:rFonts w:ascii="Consolas" w:hAnsi="Consolas"/>
           <w:sz w:val="19"/>
         </w:rPr>
-        <w:t>PLP-16-research-literature-and-evaluation</w:t>
-      </w:r>
-      <w:r>
-        <w:t xml:space="preserve"> on </w:t>
+        <w:t>PLP</w:t>
+      </w:r>
+      <w:r>
+        <w:t xml:space="preserve">, 22 milestone tasks </w:t>
       </w:r>
       <w:r>
         <w:rPr>
           <w:rFonts w:ascii="Consolas" w:hAnsi="Consolas"/>
           <w:sz w:val="19"/>
         </w:rPr>
-        <w:t>https://github.com/belozov/peer-learning-platform</w:t>
-      </w:r>
-      <w:r>
-        <w:t>.</w:t>
+        <w:t>PLP-1</w:t>
+      </w:r>
+      <w:r>
+        <w:t>..</w:t>
+      </w:r>
+      <w:r>
+        <w:rPr>
+          <w:rFonts w:ascii="Consolas" w:hAnsi="Consolas"/>
+          <w:sz w:val="19"/>
+        </w:rPr>
+        <w:t>PLP-22</w:t>
+      </w:r>
+      <w:r>
+        <w:t xml:space="preserve"> synchronized).</w:t>
       </w:r>
     </w:p>
     <w:p>
@@ -4687,7 +4697,7 @@
         <w:rPr>
           <w:b/>
         </w:rPr>
-        <w:t>Verified Commit</w:t>
+        <w:t>Remote Git Branch</w:t>
       </w:r>
       <w:r>
         <w:t xml:space="preserve">: </w:t>
@@ -4697,7 +4707,17 @@
           <w:rFonts w:ascii="Consolas" w:hAnsi="Consolas"/>
           <w:sz w:val="19"/>
         </w:rPr>
-        <w:t>24b1ceb1915bc6a627f4454a2488836dfda2f99c</w:t>
+        <w:t>PLP-16-research-literature-and-evaluation</w:t>
+      </w:r>
+      <w:r>
+        <w:t xml:space="preserve"> on </w:t>
+      </w:r>
+      <w:r>
+        <w:rPr>
+          <w:rFonts w:ascii="Consolas" w:hAnsi="Consolas"/>
+          <w:sz w:val="19"/>
+        </w:rPr>
+        <w:t>https://github.com/belozov/peer-learning-platform</w:t>
       </w:r>
       <w:r>
         <w:t>.</w:t>
@@ -4713,10 +4733,20 @@
         <w:rPr>
           <w:b/>
         </w:rPr>
-        <w:t>Pull Request Creation URL</w:t>
-      </w:r>
-      <w:r>
-        <w:t>: https://github.com/belozov/peer-learning-platform/pull/new/PLP-16-research-literature-and-evaluation</w:t>
+        <w:t>Verified Remote Commit</w:t>
+      </w:r>
+      <w:r>
+        <w:t xml:space="preserve">: </w:t>
+      </w:r>
+      <w:r>
+        <w:rPr>
+          <w:rFonts w:ascii="Consolas" w:hAnsi="Consolas"/>
+          <w:sz w:val="19"/>
+        </w:rPr>
+        <w:t>334f1c8f0369985a3a1f1d143ce3c28aa5f5885a</w:t>
+      </w:r>
+      <w:r>
+        <w:t>.</w:t>
       </w:r>
     </w:p>
     <w:p>
@@ -4729,6 +4759,22 @@
         <w:rPr>
           <w:b/>
         </w:rPr>
+        <w:t>Pull Request Creation URL</w:t>
+      </w:r>
+      <w:r>
+        <w:t>: https://github.com/belozov/peer-learning-platform/pull/new/PLP-16-research-literature-and-evaluation</w:t>
+      </w:r>
+    </w:p>
+    <w:p>
+      <w:pPr>
+        <w:pStyle w:val="ListBullet"/>
+        <w:spacing w:after="60" w:line="276" w:lineRule="auto"/>
+      </w:pPr>
+      <w:r/>
+      <w:r>
+        <w:rPr>
+          <w:b/>
+        </w:rPr>
         <w:t>Review ZIP Archive</w:t>
       </w:r>
       <w:r>
@@ -4739,10 +4785,30 @@
           <w:rFonts w:ascii="Consolas" w:hAnsi="Consolas"/>
           <w:sz w:val="19"/>
         </w:rPr>
-        <w:t>C:\Users\QWERTY\Documents\peer-learning-platform-batch-5-review.zip</w:t>
-      </w:r>
-      <w:r>
-        <w:t xml:space="preserve"> (564,388 bytes, 36 files).</w:t>
+        <w:t>C:\Users\QWERTY\Documents\peer-learning-platform-batch-6-review.zip</w:t>
+      </w:r>
+      <w:r>
+        <w:t xml:space="preserve"> (779,039 bytes, self-contained without </w:t>
+      </w:r>
+      <w:r>
+        <w:rPr>
+          <w:rFonts w:ascii="Consolas" w:hAnsi="Consolas"/>
+          <w:sz w:val="19"/>
+        </w:rPr>
+        <w:t>.git/</w:t>
+      </w:r>
+      <w:r>
+        <w:t xml:space="preserve"> or </w:t>
+      </w:r>
+      <w:r>
+        <w:rPr>
+          <w:rFonts w:ascii="Consolas" w:hAnsi="Consolas"/>
+          <w:sz w:val="19"/>
+        </w:rPr>
+        <w:t>node_modules/</w:t>
+      </w:r>
+      <w:r>
+        <w:t>).</w:t>
       </w:r>
     </w:p>
     <w:sectPr>

</xml_diff>

<commit_message>
docs(traceability): link real GitHub PR #2 and adopt real YouTrack IDs (PLP-1..PLP-22)
</commit_message>
<xml_diff>
--- a/docs/supervisor-review-report.docx
+++ b/docs/supervisor-review-report.docx
@@ -416,53 +416,36 @@
         <w:rPr>
           <w:b/>
         </w:rPr>
-        <w:t>Pending Supervisor Feedback (Component 11)</w:t>
-      </w:r>
-      <w:r>
-        <w:t xml:space="preserve">: Official review comments from Aigerim Kydyrbekova will be recorded verbatim in </w:t>
+        <w:t>YouTrack Cloud Synchronization</w:t>
+      </w:r>
+      <w:r>
+        <w:t xml:space="preserve">: </w:t>
+      </w:r>
+      <w:r>
+        <w:rPr>
+          <w:b/>
+        </w:rPr>
+        <w:t>Verified &amp; Synchronized</w:t>
+      </w:r>
+      <w:r>
+        <w:t xml:space="preserve">. Project </w:t>
       </w:r>
       <w:r>
         <w:rPr>
           <w:rFonts w:ascii="Consolas" w:hAnsi="Consolas"/>
           <w:sz w:val="19"/>
         </w:rPr>
-        <w:t>docs/supervisor-log.md</w:t>
-      </w:r>
-      <w:r>
-        <w:t xml:space="preserve"> upon review package submission.</w:t>
-      </w:r>
-    </w:p>
-    <w:p>
-      <w:pPr>
-        <w:pStyle w:val="ListBullet"/>
-        <w:spacing w:after="60" w:line="276" w:lineRule="auto"/>
-      </w:pPr>
-      <w:r/>
-      <w:r>
-        <w:rPr>
-          <w:b/>
-        </w:rPr>
-        <w:t>YouTrack Cloud Synchronization</w:t>
-      </w:r>
-      <w:r>
-        <w:t xml:space="preserve">: The cloud instance </w:t>
+        <w:t>PLP</w:t>
+      </w:r>
+      <w:r>
+        <w:t xml:space="preserve"> (https://bekzat-diploma-2027.youtrack.cloud/projects/PLP) hosts all 22 milestone tasks (</w:t>
       </w:r>
       <w:r>
         <w:rPr>
           <w:rFonts w:ascii="Consolas" w:hAnsi="Consolas"/>
           <w:sz w:val="19"/>
         </w:rPr>
-        <w:t>https://bekzat-diploma-2027.youtrack.cloud</w:t>
-      </w:r>
-      <w:r>
-        <w:t xml:space="preserve"> is active. Provisional task IDs (</w:t>
-      </w:r>
-      <w:r>
-        <w:rPr>
-          <w:rFonts w:ascii="Consolas" w:hAnsi="Consolas"/>
-          <w:sz w:val="19"/>
-        </w:rPr>
-        <w:t>PLP-01</w:t>
+        <w:t>PLP-1</w:t>
       </w:r>
       <w:r>
         <w:t xml:space="preserve"> through </w:t>
@@ -475,17 +458,7 @@
         <w:t>PLP-22</w:t>
       </w:r>
       <w:r>
-        <w:t xml:space="preserve">) are maintained in </w:t>
-      </w:r>
-      <w:r>
-        <w:rPr>
-          <w:rFonts w:ascii="Consolas" w:hAnsi="Consolas"/>
-          <w:sz w:val="19"/>
-        </w:rPr>
-        <w:t>docs/youtrack-tasks.md</w:t>
-      </w:r>
-      <w:r>
-        <w:t>; cloud issue synchronization is pending project key mapping on the cloud instance.</w:t>
+        <w:t>) with full requirements-traceable acceptance criteria.</w:t>
       </w:r>
     </w:p>
     <w:p>
@@ -4743,10 +4716,20 @@
           <w:rFonts w:ascii="Consolas" w:hAnsi="Consolas"/>
           <w:sz w:val="19"/>
         </w:rPr>
-        <w:t>334f1c8f0369985a3a1f1d143ce3c28aa5f5885a</w:t>
-      </w:r>
-      <w:r>
-        <w:t>.</w:t>
+        <w:t>34a263df7054f9a08e1781c62d08a5c378e932b1</w:t>
+      </w:r>
+      <w:r>
+        <w:t xml:space="preserve"> (on </w:t>
+      </w:r>
+      <w:r>
+        <w:rPr>
+          <w:rFonts w:ascii="Consolas" w:hAnsi="Consolas"/>
+          <w:sz w:val="19"/>
+        </w:rPr>
+        <w:t>PLP-16-research-literature-and-evaluation</w:t>
+      </w:r>
+      <w:r>
+        <w:t>).</w:t>
       </w:r>
     </w:p>
     <w:p>
@@ -4759,10 +4742,10 @@
         <w:rPr>
           <w:b/>
         </w:rPr>
-        <w:t>Pull Request Creation URL</w:t>
-      </w:r>
-      <w:r>
-        <w:t>: https://github.com/belozov/peer-learning-platform/pull/new/PLP-16-research-literature-and-evaluation</w:t>
+        <w:t>GitHub Pull Request</w:t>
+      </w:r>
+      <w:r>
+        <w:t>: https://github.com/belozov/peer-learning-platform/pull/2 (open for supervisor review).</w:t>
       </w:r>
     </w:p>
     <w:p>
@@ -4788,7 +4771,7 @@
         <w:t>C:\Users\QWERTY\Documents\peer-learning-platform-batch-6-review.zip</w:t>
       </w:r>
       <w:r>
-        <w:t xml:space="preserve"> (779,039 bytes, self-contained without </w:t>
+        <w:t xml:space="preserve"> (self-contained review package without </w:t>
       </w:r>
       <w:r>
         <w:rPr>

</xml_diff>

<commit_message>
docs(milestone): prepare official university submission tag prob-period-1
</commit_message>
<xml_diff>
--- a/docs/supervisor-review-report.docx
+++ b/docs/supervisor-review-report.docx
@@ -4372,7 +4372,7 @@
               <w:rPr>
                 <w:sz w:val="17"/>
               </w:rPr>
-              <w:t>**Completed (Synchronized)**</w:t>
+              <w:t>**Completed (Synchronized &amp; Tagged)**</w:t>
             </w:r>
           </w:p>
         </w:tc>
@@ -4706,30 +4706,10 @@
         <w:rPr>
           <w:b/>
         </w:rPr>
-        <w:t>Verified Remote Commit</w:t>
-      </w:r>
-      <w:r>
-        <w:t xml:space="preserve">: </w:t>
-      </w:r>
-      <w:r>
-        <w:rPr>
-          <w:rFonts w:ascii="Consolas" w:hAnsi="Consolas"/>
-          <w:sz w:val="19"/>
-        </w:rPr>
-        <w:t>34a263df7054f9a08e1781c62d08a5c378e932b1</w:t>
-      </w:r>
-      <w:r>
-        <w:t xml:space="preserve"> (on </w:t>
-      </w:r>
-      <w:r>
-        <w:rPr>
-          <w:rFonts w:ascii="Consolas" w:hAnsi="Consolas"/>
-          <w:sz w:val="19"/>
-        </w:rPr>
-        <w:t>PLP-16-research-literature-and-evaluation</w:t>
-      </w:r>
-      <w:r>
-        <w:t>).</w:t>
+        <w:t>GitHub Pull Request</w:t>
+      </w:r>
+      <w:r>
+        <w:t>: https://github.com/belozov/peer-learning-platform/pull/2 (PR #2, open for supervisor review).</w:t>
       </w:r>
     </w:p>
     <w:p>
@@ -4742,10 +4722,36 @@
         <w:rPr>
           <w:b/>
         </w:rPr>
-        <w:t>GitHub Pull Request</w:t>
-      </w:r>
-      <w:r>
-        <w:t>: https://github.com/belozov/peer-learning-platform/pull/2 (open for supervisor review).</w:t>
+        <w:t>Official Submission Tag</w:t>
+      </w:r>
+      <w:r>
+        <w:t xml:space="preserve">: </w:t>
+      </w:r>
+      <w:r>
+        <w:rPr>
+          <w:rFonts w:ascii="Consolas" w:hAnsi="Consolas"/>
+          <w:sz w:val="19"/>
+        </w:rPr>
+        <w:t>prob-period-1</w:t>
+      </w:r>
+      <w:r>
+        <w:t>.</w:t>
+      </w:r>
+    </w:p>
+    <w:p>
+      <w:pPr>
+        <w:pStyle w:val="ListBullet"/>
+        <w:spacing w:after="60" w:line="276" w:lineRule="auto"/>
+      </w:pPr>
+      <w:r/>
+      <w:r>
+        <w:rPr>
+          <w:b/>
+        </w:rPr>
+        <w:t>Required University Submission URL</w:t>
+      </w:r>
+      <w:r>
+        <w:t>: https://github.com/belozov/peer-learning-platform/tree/prob-period-1.</w:t>
       </w:r>
     </w:p>
     <w:p>

</xml_diff>